<commit_message>
Avisar falta de resposta correta
</commit_message>
<xml_diff>
--- a/ExemplosQti/Avaliativa Discursiva OnLine.docx
+++ b/ExemplosQti/Avaliativa Discursiva OnLine.docx
@@ -216,12 +216,18 @@
         <w:rPr>
           <w:rFonts w:ascii="Times New Roman" w:eastAsiaTheme="minorEastAsia" w:hAnsi="Times New Roman" w:cs="Times New Roman"/>
         </w:rPr>
-        <w:t>a) A</w:t>
+        <w:t>I</w:t>
       </w:r>
       <w:r>
         <w:rPr>
           <w:rFonts w:ascii="Times New Roman" w:eastAsiaTheme="minorEastAsia" w:hAnsi="Times New Roman" w:cs="Times New Roman"/>
         </w:rPr>
+        <w:t>) A</w:t>
+      </w:r>
+      <w:r>
+        <w:rPr>
+          <w:rFonts w:ascii="Times New Roman" w:eastAsiaTheme="minorEastAsia" w:hAnsi="Times New Roman" w:cs="Times New Roman"/>
+        </w:rPr>
         <w:t xml:space="preserve"> expressão matemática</w:t>
       </w:r>
       <w:r>
@@ -247,12 +253,18 @@
         <w:rPr>
           <w:rFonts w:ascii="Times New Roman" w:eastAsiaTheme="minorEastAsia" w:hAnsi="Times New Roman" w:cs="Times New Roman"/>
         </w:rPr>
-        <w:t xml:space="preserve">b) A </w:t>
+        <w:t>II</w:t>
       </w:r>
       <w:r>
         <w:rPr>
           <w:rFonts w:ascii="Times New Roman" w:eastAsiaTheme="minorEastAsia" w:hAnsi="Times New Roman" w:cs="Times New Roman"/>
         </w:rPr>
+        <w:t xml:space="preserve">) A </w:t>
+      </w:r>
+      <w:r>
+        <w:rPr>
+          <w:rFonts w:ascii="Times New Roman" w:eastAsiaTheme="minorEastAsia" w:hAnsi="Times New Roman" w:cs="Times New Roman"/>
+        </w:rPr>
         <w:t xml:space="preserve">expressão matemática que representa a </w:t>
       </w:r>
       <w:r>
@@ -272,38 +284,56 @@
         <w:rPr>
           <w:rFonts w:ascii="Times New Roman" w:eastAsiaTheme="minorEastAsia" w:hAnsi="Times New Roman" w:cs="Times New Roman"/>
         </w:rPr>
-        <w:t>c) O valor do custo fixo.</w:t>
-      </w:r>
-    </w:p>
-    <w:p>
-      <w:pPr>
+        <w:t>III</w:t>
+      </w:r>
+      <w:r>
         <w:rPr>
           <w:rFonts w:ascii="Times New Roman" w:eastAsiaTheme="minorEastAsia" w:hAnsi="Times New Roman" w:cs="Times New Roman"/>
         </w:rPr>
-      </w:pPr>
-      <w:r>
+        <w:t>) O valor do custo fixo.</w:t>
+      </w:r>
+    </w:p>
+    <w:p>
+      <w:pPr>
         <w:rPr>
           <w:rFonts w:ascii="Times New Roman" w:eastAsiaTheme="minorEastAsia" w:hAnsi="Times New Roman" w:cs="Times New Roman"/>
         </w:rPr>
-        <w:t>d) O ponto de equilíbrio.</w:t>
-      </w:r>
-    </w:p>
-    <w:p>
-      <w:pPr>
+      </w:pPr>
+      <w:r>
         <w:rPr>
           <w:rFonts w:ascii="Times New Roman" w:eastAsiaTheme="minorEastAsia" w:hAnsi="Times New Roman" w:cs="Times New Roman"/>
         </w:rPr>
-      </w:pPr>
+        <w:t>IV</w:t>
+      </w:r>
       <w:r>
         <w:rPr>
           <w:rFonts w:ascii="Times New Roman" w:eastAsiaTheme="minorEastAsia" w:hAnsi="Times New Roman" w:cs="Times New Roman"/>
         </w:rPr>
-        <w:t>e) Gráfico das funções de Lucro e Custo</w:t>
-      </w:r>
-      <w:r>
+        <w:t>) O ponto de equilíbrio.</w:t>
+      </w:r>
+    </w:p>
+    <w:p>
+      <w:pPr>
         <w:rPr>
           <w:rFonts w:ascii="Times New Roman" w:eastAsiaTheme="minorEastAsia" w:hAnsi="Times New Roman" w:cs="Times New Roman"/>
         </w:rPr>
+      </w:pPr>
+      <w:r>
+        <w:rPr>
+          <w:rFonts w:ascii="Times New Roman" w:eastAsiaTheme="minorEastAsia" w:hAnsi="Times New Roman" w:cs="Times New Roman"/>
+        </w:rPr>
+        <w:t>V</w:t>
+      </w:r>
+      <w:r>
+        <w:rPr>
+          <w:rFonts w:ascii="Times New Roman" w:eastAsiaTheme="minorEastAsia" w:hAnsi="Times New Roman" w:cs="Times New Roman"/>
+        </w:rPr>
+        <w:t>) Gráfico das funções de Lucro e Custo</w:t>
+      </w:r>
+      <w:r>
+        <w:rPr>
+          <w:rFonts w:ascii="Times New Roman" w:eastAsiaTheme="minorEastAsia" w:hAnsi="Times New Roman" w:cs="Times New Roman"/>
+        </w:rPr>
         <w:t xml:space="preserve"> num mesmo plano cartesiano</w:t>
       </w:r>
       <w:r>
@@ -323,7 +353,13 @@
         <w:rPr>
           <w:rFonts w:ascii="Times New Roman" w:eastAsiaTheme="minorEastAsia" w:hAnsi="Times New Roman" w:cs="Times New Roman"/>
         </w:rPr>
-        <w:t xml:space="preserve">f) </w:t>
+        <w:t>VI</w:t>
+      </w:r>
+      <w:r>
+        <w:rPr>
+          <w:rFonts w:ascii="Times New Roman" w:eastAsiaTheme="minorEastAsia" w:hAnsi="Times New Roman" w:cs="Times New Roman"/>
+        </w:rPr>
+        <w:t xml:space="preserve">) </w:t>
       </w:r>
       <w:r>
         <w:rPr>
@@ -1942,7 +1978,13 @@
         <w:rPr>
           <w:rFonts w:eastAsiaTheme="minorEastAsia" w:cstheme="minorHAnsi"/>
         </w:rPr>
-        <w:t>a)</w:t>
+        <w:t>I</w:t>
+      </w:r>
+      <w:r>
+        <w:rPr>
+          <w:rFonts w:eastAsiaTheme="minorEastAsia" w:cstheme="minorHAnsi"/>
+        </w:rPr>
+        <w:t>)</w:t>
       </w:r>
       <w:r>
         <w:rPr>
@@ -1973,20 +2015,32 @@
         <w:rPr>
           <w:rFonts w:eastAsiaTheme="minorEastAsia" w:cstheme="minorHAnsi"/>
         </w:rPr>
-        <w:t>b) O valor do custo fixo.</w:t>
-      </w:r>
-    </w:p>
-    <w:p>
-      <w:pPr>
-        <w:rPr>
-          <w:rFonts w:eastAsiaTheme="minorEastAsia" w:cstheme="minorHAnsi"/>
-        </w:rPr>
-      </w:pPr>
-      <w:r>
-        <w:rPr>
-          <w:rFonts w:eastAsiaTheme="minorEastAsia" w:cstheme="minorHAnsi"/>
-        </w:rPr>
-        <w:t xml:space="preserve">c) A expressão matemática que representa a </w:t>
+        <w:t>II</w:t>
+      </w:r>
+      <w:r>
+        <w:rPr>
+          <w:rFonts w:eastAsiaTheme="minorEastAsia" w:cstheme="minorHAnsi"/>
+        </w:rPr>
+        <w:t>) O valor do custo fixo.</w:t>
+      </w:r>
+    </w:p>
+    <w:p>
+      <w:pPr>
+        <w:rPr>
+          <w:rFonts w:eastAsiaTheme="minorEastAsia" w:cstheme="minorHAnsi"/>
+        </w:rPr>
+      </w:pPr>
+      <w:r>
+        <w:rPr>
+          <w:rFonts w:eastAsiaTheme="minorEastAsia" w:cstheme="minorHAnsi"/>
+        </w:rPr>
+        <w:t>III</w:t>
+      </w:r>
+      <w:r>
+        <w:rPr>
+          <w:rFonts w:eastAsiaTheme="minorEastAsia" w:cstheme="minorHAnsi"/>
+        </w:rPr>
+        <w:t xml:space="preserve">) A expressão matemática que representa a </w:t>
       </w:r>
       <w:r>
         <w:rPr>
@@ -2005,7 +2059,13 @@
         <w:rPr>
           <w:rFonts w:eastAsiaTheme="minorEastAsia" w:cstheme="minorHAnsi"/>
         </w:rPr>
-        <w:t xml:space="preserve">d) </w:t>
+        <w:t>IV</w:t>
+      </w:r>
+      <w:r>
+        <w:rPr>
+          <w:rFonts w:eastAsiaTheme="minorEastAsia" w:cstheme="minorHAnsi"/>
+        </w:rPr>
+        <w:t xml:space="preserve">) </w:t>
       </w:r>
       <w:r>
         <w:rPr>
@@ -2024,7 +2084,7 @@
         <w:rPr>
           <w:rFonts w:eastAsiaTheme="minorEastAsia" w:cstheme="minorHAnsi"/>
         </w:rPr>
-        <w:t>e</w:t>
+        <w:t>V</w:t>
       </w:r>
       <w:r>
         <w:rPr>
@@ -2049,7 +2109,7 @@
         <w:rPr>
           <w:rFonts w:eastAsiaTheme="minorEastAsia" w:cstheme="minorHAnsi"/>
         </w:rPr>
-        <w:t>f</w:t>
+        <w:t>VI</w:t>
       </w:r>
       <w:r>
         <w:rPr>

</xml_diff>

<commit_message>
corrigindo importação de word com imagem
</commit_message>
<xml_diff>
--- a/ExemplosQti/Avaliativa Discursiva OnLine.docx
+++ b/ExemplosQti/Avaliativa Discursiva OnLine.docx
@@ -453,7 +453,14 @@
           <w:rFonts w:cstheme="minorHAnsi"/>
           <w:color w:val="FF0000"/>
         </w:rPr>
-        <w:t xml:space="preserve">a) </w:t>
+        <w:t>I</w:t>
+      </w:r>
+      <w:r>
+        <w:rPr>
+          <w:rFonts w:cstheme="minorHAnsi"/>
+          <w:color w:val="FF0000"/>
+        </w:rPr>
+        <w:t xml:space="preserve">) </w:t>
       </w:r>
       <w:r>
         <w:rPr>
@@ -635,7 +642,14 @@
           <w:rFonts w:cstheme="minorHAnsi"/>
           <w:color w:val="FF0000"/>
         </w:rPr>
-        <w:t xml:space="preserve">b) </w:t>
+        <w:t>II</w:t>
+      </w:r>
+      <w:r>
+        <w:rPr>
+          <w:rFonts w:cstheme="minorHAnsi"/>
+          <w:color w:val="FF0000"/>
+        </w:rPr>
+        <w:t xml:space="preserve">) </w:t>
       </w:r>
       <w:r>
         <w:rPr>
@@ -859,7 +873,7 @@
           <w:rFonts w:eastAsiaTheme="minorEastAsia" w:cstheme="minorHAnsi"/>
           <w:color w:val="FF0000"/>
         </w:rPr>
-        <w:t>c</w:t>
+        <w:t>III</w:t>
       </w:r>
       <w:r>
         <w:rPr>
@@ -867,6 +881,13 @@
           <w:color w:val="FF0000"/>
         </w:rPr>
         <w:t>)</w:t>
+      </w:r>
+      <w:r>
+        <w:rPr>
+          <w:rFonts w:eastAsiaTheme="minorEastAsia" w:cstheme="minorHAnsi"/>
+          <w:color w:val="FF0000"/>
+        </w:rPr>
+        <w:t xml:space="preserve"> </w:t>
       </w:r>
       <w:r>
         <w:rPr>
@@ -976,7 +997,7 @@
           <w:rFonts w:eastAsiaTheme="minorEastAsia" w:cstheme="minorHAnsi"/>
           <w:color w:val="FF0000"/>
         </w:rPr>
-        <w:t>d)</w:t>
+        <w:t xml:space="preserve">IV) </w:t>
       </w:r>
       <w:r>
         <w:rPr>
@@ -1302,10 +1323,17 @@
       </w:r>
       <w:r>
         <w:rPr>
-          <w:rFonts w:cstheme="minorHAnsi"/>
-          <w:color w:val="FF0000"/>
-        </w:rPr>
-        <w:t>e)</w:t>
+          <w:rFonts w:eastAsiaTheme="minorEastAsia" w:cstheme="minorHAnsi"/>
+          <w:color w:val="FF0000"/>
+        </w:rPr>
+        <w:t>V</w:t>
+      </w:r>
+      <w:r>
+        <w:rPr>
+          <w:rFonts w:eastAsiaTheme="minorEastAsia" w:cstheme="minorHAnsi"/>
+          <w:color w:val="FF0000"/>
+        </w:rPr>
+        <w:t>)</w:t>
       </w:r>
     </w:p>
     <w:p>
@@ -1419,7 +1447,14 @@
           <w:rFonts w:cstheme="minorHAnsi"/>
           <w:color w:val="FF0000"/>
         </w:rPr>
-        <w:t xml:space="preserve">f) </w:t>
+        <w:t>VI</w:t>
+      </w:r>
+      <w:r>
+        <w:rPr>
+          <w:rFonts w:cstheme="minorHAnsi"/>
+          <w:color w:val="FF0000"/>
+        </w:rPr>
+        <w:t xml:space="preserve">) </w:t>
       </w:r>
       <w:r>
         <w:rPr>
@@ -2195,7 +2230,7 @@
           <w:rFonts w:cstheme="minorHAnsi"/>
           <w:color w:val="FF0000"/>
         </w:rPr>
-        <w:t>a</w:t>
+        <w:t>I</w:t>
       </w:r>
       <w:r>
         <w:rPr>
@@ -2330,7 +2365,14 @@
           <w:rFonts w:cstheme="minorHAnsi"/>
           <w:color w:val="FF0000"/>
         </w:rPr>
-        <w:t xml:space="preserve">b) </w:t>
+        <w:t>II</w:t>
+      </w:r>
+      <w:r>
+        <w:rPr>
+          <w:rFonts w:cstheme="minorHAnsi"/>
+          <w:color w:val="FF0000"/>
+        </w:rPr>
+        <w:t xml:space="preserve">) </w:t>
       </w:r>
       <w:r>
         <w:rPr>
@@ -2467,7 +2509,14 @@
           <w:rFonts w:eastAsiaTheme="minorEastAsia" w:cstheme="minorHAnsi"/>
           <w:color w:val="FF0000"/>
         </w:rPr>
-        <w:t xml:space="preserve">c) </w:t>
+        <w:t>III</w:t>
+      </w:r>
+      <w:r>
+        <w:rPr>
+          <w:rFonts w:eastAsiaTheme="minorEastAsia" w:cstheme="minorHAnsi"/>
+          <w:color w:val="FF0000"/>
+        </w:rPr>
+        <w:t xml:space="preserve">) </w:t>
       </w:r>
       <w:r>
         <w:rPr>
@@ -2711,10 +2760,24 @@
       </w:r>
       <w:r>
         <w:rPr>
-          <w:rFonts w:eastAsiaTheme="minorEastAsia" w:cstheme="minorHAnsi"/>
-          <w:color w:val="FF0000"/>
-        </w:rPr>
-        <w:t xml:space="preserve">d) </w:t>
+          <w:rFonts w:cstheme="minorHAnsi"/>
+          <w:color w:val="FF0000"/>
+        </w:rPr>
+        <w:t>I</w:t>
+      </w:r>
+      <w:r>
+        <w:rPr>
+          <w:rFonts w:eastAsiaTheme="minorEastAsia" w:cstheme="minorHAnsi"/>
+          <w:color w:val="FF0000"/>
+        </w:rPr>
+        <w:t>V</w:t>
+      </w:r>
+      <w:r>
+        <w:rPr>
+          <w:rFonts w:eastAsiaTheme="minorEastAsia" w:cstheme="minorHAnsi"/>
+          <w:color w:val="FF0000"/>
+        </w:rPr>
+        <w:t xml:space="preserve">) </w:t>
       </w:r>
       <w:r>
         <w:rPr>
@@ -3091,7 +3154,14 @@
           <w:rFonts w:cstheme="minorHAnsi"/>
           <w:color w:val="FF0000"/>
         </w:rPr>
-        <w:t xml:space="preserve">e) </w:t>
+        <w:t>V</w:t>
+      </w:r>
+      <w:r>
+        <w:rPr>
+          <w:rFonts w:cstheme="minorHAnsi"/>
+          <w:color w:val="FF0000"/>
+        </w:rPr>
+        <w:t xml:space="preserve">) </w:t>
       </w:r>
     </w:p>
     <w:p>
@@ -3241,7 +3311,14 @@
           <w:rFonts w:cstheme="minorHAnsi"/>
           <w:color w:val="FF0000"/>
         </w:rPr>
-        <w:t xml:space="preserve">f) </w:t>
+        <w:t>VI</w:t>
+      </w:r>
+      <w:r>
+        <w:rPr>
+          <w:rFonts w:cstheme="minorHAnsi"/>
+          <w:color w:val="FF0000"/>
+        </w:rPr>
+        <w:t xml:space="preserve">) </w:t>
       </w:r>
       <m:oMath>
         <m:r>
@@ -4107,7 +4184,6 @@
   <w:style w:type="character" w:default="1" w:styleId="Fontepargpadro">
     <w:name w:val="Default Paragraph Font"/>
     <w:uiPriority w:val="1"/>
-    <w:semiHidden/>
     <w:unhideWhenUsed/>
   </w:style>
   <w:style w:type="table" w:default="1" w:styleId="Tabelanormal">

</xml_diff>